<commit_message>
Reduce SAQ assessment to five questions
</commit_message>
<xml_diff>
--- a/Assessments/Answer to WA (SAQ) - Microsoft Certified Azure AI Engineer Associate AI-102 Training - v1.0.docx
+++ b/Assessments/Answer to WA (SAQ) - Microsoft Certified Azure AI Engineer Associate AI-102 Training - v1.0.docx
@@ -1243,7 +1243,7 @@
           <w:color w:val="111827"/>
           <w:sz w:val="23"/>
         </w:rPr>
-        <w:t>Question 1 (K1) - PPT slides 17-21; Lab 1</w:t>
+        <w:t>Question 1 (K1) - PPT slides 17-21 and 22-26; Labs 1-2</w:t>
       </w:r>
     </w:p>
     <w:p>
@@ -1258,7 +1258,7 @@
           <w:color w:val="111827"/>
           <w:sz w:val="21"/>
         </w:rPr>
-        <w:t>Why is service selection part of AI engineering?</w:t>
+        <w:t>Explain how you would select and manage the Azure AI resources, secure access, monitor usage and cost, and apply responsible AI, content safety and governance controls.</w:t>
       </w:r>
     </w:p>
     <w:p>
@@ -1274,37 +1274,7 @@
           <w:color w:val="111827"/>
           <w:sz w:val="20"/>
         </w:rPr>
-        <w:t>The engineer maps business requirements to the right Azure AI services, deployment model, integrations, constraints, cost, security and operational controls so the solution is feasible and maintainable.</w:t>
-      </w:r>
-    </w:p>
-    <w:p>
-      <w:pPr>
-        <w:spacing w:before="160" w:after="40"/>
-      </w:pPr>
-      <w:r>
-        <w:rPr>
-          <w:rFonts w:ascii="Arial" w:hAnsi="Arial"/>
-          <w:b/>
-          <w:i w:val="0"/>
-          <w:color w:val="111827"/>
-          <w:sz w:val="23"/>
-        </w:rPr>
-        <w:t>Question 2 (K2) - PPT slides 17-21; Lab 1</w:t>
-      </w:r>
-    </w:p>
-    <w:p>
-      <w:pPr>
-        <w:spacing w:before="0" w:after="60"/>
-      </w:pPr>
-      <w:r>
-        <w:rPr>
-          <w:rFonts w:ascii="Arial" w:hAnsi="Arial"/>
-          <w:b/>
-          <w:i w:val="0"/>
-          <w:color w:val="111827"/>
-          <w:sz w:val="21"/>
-        </w:rPr>
-        <w:t>Why should keys be protected?</w:t>
+        <w:t>Map business, data, integration, region, performance and cost requirements to the appropriate Azure AI services and deployment model.</w:t>
       </w:r>
     </w:p>
     <w:p>
@@ -1320,37 +1290,7 @@
           <w:color w:val="111827"/>
           <w:sz w:val="20"/>
         </w:rPr>
-        <w:t>Keys grant access to Azure AI resources. They must be stored securely, rotated, and replaced with managed identity or least-privilege access where possible.</w:t>
-      </w:r>
-    </w:p>
-    <w:p>
-      <w:pPr>
-        <w:spacing w:before="160" w:after="40"/>
-      </w:pPr>
-      <w:r>
-        <w:rPr>
-          <w:rFonts w:ascii="Arial" w:hAnsi="Arial"/>
-          <w:b/>
-          <w:i w:val="0"/>
-          <w:color w:val="111827"/>
-          <w:sz w:val="23"/>
-        </w:rPr>
-        <w:t>Question 3 (K3) - PPT slides 17-21; Lab 1</w:t>
-      </w:r>
-    </w:p>
-    <w:p>
-      <w:pPr>
-        <w:spacing w:before="0" w:after="60"/>
-      </w:pPr>
-      <w:r>
-        <w:rPr>
-          <w:rFonts w:ascii="Arial" w:hAnsi="Arial"/>
-          <w:b/>
-          <w:i w:val="0"/>
-          <w:color w:val="111827"/>
-          <w:sz w:val="21"/>
-        </w:rPr>
-        <w:t>What should be monitored in an AI service?</w:t>
+        <w:t>Protect keys, prefer managed identity and least privilege, separate environments, rotate secrets and secure network access.</w:t>
       </w:r>
     </w:p>
     <w:p>
@@ -1366,37 +1306,7 @@
           <w:color w:val="111827"/>
           <w:sz w:val="20"/>
         </w:rPr>
-        <w:t>Monitor usage, latency, errors, token or transaction consumption, cost, model/output quality signals, safety events, authentication failures and availability.</w:t>
-      </w:r>
-    </w:p>
-    <w:p>
-      <w:pPr>
-        <w:spacing w:before="160" w:after="40"/>
-      </w:pPr>
-      <w:r>
-        <w:rPr>
-          <w:rFonts w:ascii="Arial" w:hAnsi="Arial"/>
-          <w:b/>
-          <w:i w:val="0"/>
-          <w:color w:val="111827"/>
-          <w:sz w:val="23"/>
-        </w:rPr>
-        <w:t>Question 4 (K4) - PPT slides 17-21; Lab 1</w:t>
-      </w:r>
-    </w:p>
-    <w:p>
-      <w:pPr>
-        <w:spacing w:before="0" w:after="60"/>
-      </w:pPr>
-      <w:r>
-        <w:rPr>
-          <w:rFonts w:ascii="Arial" w:hAnsi="Arial"/>
-          <w:b/>
-          <w:i w:val="0"/>
-          <w:color w:val="111827"/>
-          <w:sz w:val="21"/>
-        </w:rPr>
-        <w:t>What is the role of responsible AI planning?</w:t>
+        <w:t>Monitor availability, latency, failures, consumption, cost, quality and safety signals with alerts and operational ownership.</w:t>
       </w:r>
     </w:p>
     <w:p>
@@ -1412,7 +1322,7 @@
           <w:color w:val="111827"/>
           <w:sz w:val="20"/>
         </w:rPr>
-        <w:t>It identifies risks early and defines fairness, safety, privacy, transparency, accountability, escalation and monitoring controls before production deployment.</w:t>
+        <w:t>Apply risk assessment, content filters, prompt shields, privacy controls, human escalation, incident response and accountable governance.</w:t>
       </w:r>
     </w:p>
     <w:p>
@@ -1427,7 +1337,7 @@
           <w:color w:val="111827"/>
           <w:sz w:val="23"/>
         </w:rPr>
-        <w:t>Question 5 (K5) - PPT slides 22-26; Lab 2</w:t>
+        <w:t>Question 2 (K2) - PPT slides 27-31 and 32-36; Labs 3-4</w:t>
       </w:r>
     </w:p>
     <w:p>
@@ -1442,7 +1352,7 @@
           <w:color w:val="111827"/>
           <w:sz w:val="21"/>
         </w:rPr>
-        <w:t>What are content filters?</w:t>
+        <w:t>Describe a grounded generative AI and agent solution, including RAG, prompt templates and evaluation, agent tools and permissions, orchestration, tracing, and human control of autonomous actions.</w:t>
       </w:r>
     </w:p>
     <w:p>
@@ -1458,37 +1368,7 @@
           <w:color w:val="111827"/>
           <w:sz w:val="20"/>
         </w:rPr>
-        <w:t>Controls that detect or block harmful categories of input or output, such as violence, hate, sexual content, self-harm, jailbreak attempts or unsafe generated responses.</w:t>
-      </w:r>
-    </w:p>
-    <w:p>
-      <w:pPr>
-        <w:spacing w:before="160" w:after="40"/>
-      </w:pPr>
-      <w:r>
-        <w:rPr>
-          <w:rFonts w:ascii="Arial" w:hAnsi="Arial"/>
-          <w:b/>
-          <w:i w:val="0"/>
-          <w:color w:val="111827"/>
-          <w:sz w:val="23"/>
-        </w:rPr>
-        <w:t>Question 6 (K6) - PPT slides 22-26; Lab 2</w:t>
-      </w:r>
-    </w:p>
-    <w:p>
-      <w:pPr>
-        <w:spacing w:before="0" w:after="60"/>
-      </w:pPr>
-      <w:r>
-        <w:rPr>
-          <w:rFonts w:ascii="Arial" w:hAnsi="Arial"/>
-          <w:b/>
-          <w:i w:val="0"/>
-          <w:color w:val="111827"/>
-          <w:sz w:val="21"/>
-        </w:rPr>
-        <w:t>What is a prompt shield?</w:t>
+        <w:t>Use RAG to retrieve approved content, pass relevant context to the model and return grounded answers with traceable sources.</w:t>
       </w:r>
     </w:p>
     <w:p>
@@ -1504,37 +1384,7 @@
           <w:color w:val="111827"/>
           <w:sz w:val="20"/>
         </w:rPr>
-        <w:t>A control that helps detect and mitigate prompt injection, jailbreak and indirect prompt attacks that try to override system instructions or expose data.</w:t>
-      </w:r>
-    </w:p>
-    <w:p>
-      <w:pPr>
-        <w:spacing w:before="160" w:after="40"/>
-      </w:pPr>
-      <w:r>
-        <w:rPr>
-          <w:rFonts w:ascii="Arial" w:hAnsi="Arial"/>
-          <w:b/>
-          <w:i w:val="0"/>
-          <w:color w:val="111827"/>
-          <w:sz w:val="23"/>
-        </w:rPr>
-        <w:t>Question 7 (K7) - PPT slides 22-26; Lab 2</w:t>
-      </w:r>
-    </w:p>
-    <w:p>
-      <w:pPr>
-        <w:spacing w:before="0" w:after="60"/>
-      </w:pPr>
-      <w:r>
-        <w:rPr>
-          <w:rFonts w:ascii="Arial" w:hAnsi="Arial"/>
-          <w:b/>
-          <w:i w:val="0"/>
-          <w:color w:val="111827"/>
-          <w:sz w:val="21"/>
-        </w:rPr>
-        <w:t>Why is human escalation important?</w:t>
+        <w:t>Use prompt templates and prompt flow to standardize instructions, inputs, constraints and outputs, then evaluate quality, groundedness and safety.</w:t>
       </w:r>
     </w:p>
     <w:p>
@@ -1550,37 +1400,7 @@
           <w:color w:val="111827"/>
           <w:sz w:val="20"/>
         </w:rPr>
-        <w:t>It provides accountability and review for uncertain, harmful, high-impact or low-confidence cases where automated output should not be final.</w:t>
-      </w:r>
-    </w:p>
-    <w:p>
-      <w:pPr>
-        <w:spacing w:before="160" w:after="40"/>
-      </w:pPr>
-      <w:r>
-        <w:rPr>
-          <w:rFonts w:ascii="Arial" w:hAnsi="Arial"/>
-          <w:b/>
-          <w:i w:val="0"/>
-          <w:color w:val="111827"/>
-          <w:sz w:val="23"/>
-        </w:rPr>
-        <w:t>Question 8 (K8) - PPT slides 22-26; Lab 2</w:t>
-      </w:r>
-    </w:p>
-    <w:p>
-      <w:pPr>
-        <w:spacing w:before="0" w:after="60"/>
-      </w:pPr>
-      <w:r>
-        <w:rPr>
-          <w:rFonts w:ascii="Arial" w:hAnsi="Arial"/>
-          <w:b/>
-          <w:i w:val="0"/>
-          <w:color w:val="111827"/>
-          <w:sz w:val="21"/>
-        </w:rPr>
-        <w:t>Who is accountable for AI output?</w:t>
+        <w:t>Give agents only approved tools and least-privilege permissions; orchestrate tool calls, memory, retrieval and any agent handoffs.</w:t>
       </w:r>
     </w:p>
     <w:p>
@@ -1596,7 +1416,7 @@
           <w:color w:val="111827"/>
           <w:sz w:val="20"/>
         </w:rPr>
-        <w:t>The organization deploying the system remains accountable through its product owner, governance process and assigned responsible personnel.</w:t>
+        <w:t>Trace prompts, retrieval and tool actions, constrain high-impact actions, and require human approval or escalation where appropriate.</w:t>
       </w:r>
     </w:p>
     <w:p>
@@ -1611,7 +1431,7 @@
           <w:color w:val="111827"/>
           <w:sz w:val="23"/>
         </w:rPr>
-        <w:t>Question 9 (K9) - PPT slides 27-31; Lab 3</w:t>
+        <w:t>Question 3 (K3) - PPT slides 37-41 and 42-46; Labs 5-6</w:t>
       </w:r>
     </w:p>
     <w:p>
@@ -1626,7 +1446,7 @@
           <w:color w:val="111827"/>
           <w:sz w:val="21"/>
         </w:rPr>
-        <w:t>What is RAG?</w:t>
+        <w:t>Explain how Azure vision, language, speech and translation capabilities could support this workflow, including when custom models, PII protection and human review are required.</w:t>
       </w:r>
     </w:p>
     <w:p>
@@ -1642,37 +1462,7 @@
           <w:color w:val="111827"/>
           <w:sz w:val="20"/>
         </w:rPr>
-        <w:t>Retrieval-augmented generation combines search or retrieval from trusted sources with a generative model so answers are grounded in approved content.</w:t>
-      </w:r>
-    </w:p>
-    <w:p>
-      <w:pPr>
-        <w:spacing w:before="160" w:after="40"/>
-      </w:pPr>
-      <w:r>
-        <w:rPr>
-          <w:rFonts w:ascii="Arial" w:hAnsi="Arial"/>
-          <w:b/>
-          <w:i w:val="0"/>
-          <w:color w:val="111827"/>
-          <w:sz w:val="23"/>
-        </w:rPr>
-        <w:t>Question 10 (K10) - PPT slides 27-31; Lab 3</w:t>
-      </w:r>
-    </w:p>
-    <w:p>
-      <w:pPr>
-        <w:spacing w:before="0" w:after="60"/>
-      </w:pPr>
-      <w:r>
-        <w:rPr>
-          <w:rFonts w:ascii="Arial" w:hAnsi="Arial"/>
-          <w:b/>
-          <w:i w:val="0"/>
-          <w:color w:val="111827"/>
-          <w:sz w:val="21"/>
-        </w:rPr>
-        <w:t>Why are prompt templates useful?</w:t>
+        <w:t>Use image analysis, OCR, classification or object detection according to the visual requirement; train a custom vision model when prebuilt capabilities do not meet the domain need.</w:t>
       </w:r>
     </w:p>
     <w:p>
@@ -1688,37 +1478,7 @@
           <w:color w:val="111827"/>
           <w:sz w:val="20"/>
         </w:rPr>
-        <w:t>They standardize instructions, input variables, constraints, tone and output format so model behavior is more repeatable and easier to evaluate.</w:t>
-      </w:r>
-    </w:p>
-    <w:p>
-      <w:pPr>
-        <w:spacing w:before="160" w:after="40"/>
-      </w:pPr>
-      <w:r>
-        <w:rPr>
-          <w:rFonts w:ascii="Arial" w:hAnsi="Arial"/>
-          <w:b/>
-          <w:i w:val="0"/>
-          <w:color w:val="111827"/>
-          <w:sz w:val="23"/>
-        </w:rPr>
-        <w:t>Question 11 (K11) - PPT slides 27-31; Lab 3</w:t>
-      </w:r>
-    </w:p>
-    <w:p>
-      <w:pPr>
-        <w:spacing w:before="0" w:after="60"/>
-      </w:pPr>
-      <w:r>
-        <w:rPr>
-          <w:rFonts w:ascii="Arial" w:hAnsi="Arial"/>
-          <w:b/>
-          <w:i w:val="0"/>
-          <w:color w:val="111827"/>
-          <w:sz w:val="21"/>
-        </w:rPr>
-        <w:t>What does tracing help debug?</w:t>
+        <w:t>Treat video and image data as sensitive and apply consent, retention, privacy, bias and access controls.</w:t>
       </w:r>
     </w:p>
     <w:p>
@@ -1734,37 +1494,7 @@
           <w:color w:val="111827"/>
           <w:sz w:val="20"/>
         </w:rPr>
-        <w:t>Tracing helps inspect prompt flow execution, retrieved context, tool calls, intermediate outputs, failures, latency and data passed between steps.</w:t>
-      </w:r>
-    </w:p>
-    <w:p>
-      <w:pPr>
-        <w:spacing w:before="160" w:after="40"/>
-      </w:pPr>
-      <w:r>
-        <w:rPr>
-          <w:rFonts w:ascii="Arial" w:hAnsi="Arial"/>
-          <w:b/>
-          <w:i w:val="0"/>
-          <w:color w:val="111827"/>
-          <w:sz w:val="23"/>
-        </w:rPr>
-        <w:t>Question 12 (K12) - PPT slides 27-31; Lab 3</w:t>
-      </w:r>
-    </w:p>
-    <w:p>
-      <w:pPr>
-        <w:spacing w:before="0" w:after="60"/>
-      </w:pPr>
-      <w:r>
-        <w:rPr>
-          <w:rFonts w:ascii="Arial" w:hAnsi="Arial"/>
-          <w:b/>
-          <w:i w:val="0"/>
-          <w:color w:val="111827"/>
-          <w:sz w:val="21"/>
-        </w:rPr>
-        <w:t>How can feedback improve a generative AI solution?</w:t>
+        <w:t>Use language analysis for entities, sentiment, key phrases and PII detection before storing or sharing text.</w:t>
       </w:r>
     </w:p>
     <w:p>
@@ -1780,7 +1510,7 @@
           <w:color w:val="111827"/>
           <w:sz w:val="20"/>
         </w:rPr>
-        <w:t>Feedback supplies examples for evaluation, prompt improvement, grounding refinements, safety tuning and prioritizing recurring failure cases.</w:t>
+        <w:t>Use speech recognition, SSML-based synthesis and translation, with human review for sensitive, regulated, ambiguous or customer-facing outputs.</w:t>
       </w:r>
     </w:p>
     <w:p>
@@ -1795,7 +1525,7 @@
           <w:color w:val="111827"/>
           <w:sz w:val="23"/>
         </w:rPr>
-        <w:t>Question 13 (K13) - PPT slides 32-36; Lab 4</w:t>
+        <w:t>Question 4 (K4) - PPT slides 48-52 and 53-57; Labs 7-8</w:t>
       </w:r>
     </w:p>
     <w:p>
@@ -1810,7 +1540,7 @@
           <w:color w:val="111827"/>
           <w:sz w:val="21"/>
         </w:rPr>
-        <w:t>What is an AI agent?</w:t>
+        <w:t>Design the language understanding, question answering and Azure AI Search components, covering intents, entities, training data, indexers, skillsets, vector search, semantic ranking, and backup or recovery.</w:t>
       </w:r>
     </w:p>
     <w:p>
@@ -1826,37 +1556,7 @@
           <w:color w:val="111827"/>
           <w:sz w:val="20"/>
         </w:rPr>
-        <w:t>An AI system that can reason over a task, use tools or knowledge sources, follow instructions and take controlled actions toward a goal.</w:t>
-      </w:r>
-    </w:p>
-    <w:p>
-      <w:pPr>
-        <w:spacing w:before="160" w:after="40"/>
-      </w:pPr>
-      <w:r>
-        <w:rPr>
-          <w:rFonts w:ascii="Arial" w:hAnsi="Arial"/>
-          <w:b/>
-          <w:i w:val="0"/>
-          <w:color w:val="111827"/>
-          <w:sz w:val="23"/>
-        </w:rPr>
-        <w:t>Question 14 (K14) - PPT slides 32-36; Lab 4</w:t>
-      </w:r>
-    </w:p>
-    <w:p>
-      <w:pPr>
-        <w:spacing w:before="0" w:after="60"/>
-      </w:pPr>
-      <w:r>
-        <w:rPr>
-          <w:rFonts w:ascii="Arial" w:hAnsi="Arial"/>
-          <w:b/>
-          <w:i w:val="0"/>
-          <w:color w:val="111827"/>
-          <w:sz w:val="21"/>
-        </w:rPr>
-        <w:t>Why do agents need tool permissions?</w:t>
+        <w:t>Define representative intents, entities and varied utterances; train, test and improve the language project across expected wording and languages.</w:t>
       </w:r>
     </w:p>
     <w:p>
@@ -1872,37 +1572,7 @@
           <w:color w:val="111827"/>
           <w:sz w:val="20"/>
         </w:rPr>
-        <w:t>Permissions limit what an agent can access or change, enforcing least privilege and reducing the impact of erroneous or malicious actions.</w:t>
-      </w:r>
-    </w:p>
-    <w:p>
-      <w:pPr>
-        <w:spacing w:before="160" w:after="40"/>
-      </w:pPr>
-      <w:r>
-        <w:rPr>
-          <w:rFonts w:ascii="Arial" w:hAnsi="Arial"/>
-          <w:b/>
-          <w:i w:val="0"/>
-          <w:color w:val="111827"/>
-          <w:sz w:val="23"/>
-        </w:rPr>
-        <w:t>Question 15 (K15) - PPT slides 32-36; Lab 4</w:t>
-      </w:r>
-    </w:p>
-    <w:p>
-      <w:pPr>
-        <w:spacing w:before="0" w:after="60"/>
-      </w:pPr>
-      <w:r>
-        <w:rPr>
-          <w:rFonts w:ascii="Arial" w:hAnsi="Arial"/>
-          <w:b/>
-          <w:i w:val="0"/>
-          <w:color w:val="111827"/>
-          <w:sz w:val="21"/>
-        </w:rPr>
-        <w:t>What is orchestration?</w:t>
+        <w:t>Use custom question answering for curated answers and preserve project exports, labels, configuration and versions for recovery.</w:t>
       </w:r>
     </w:p>
     <w:p>
@@ -1918,37 +1588,7 @@
           <w:color w:val="111827"/>
           <w:sz w:val="20"/>
         </w:rPr>
-        <w:t>The coordination of model reasoning, tools, workflows, memory, retrieval, handoffs and sometimes multiple agents to complete a task safely.</w:t>
-      </w:r>
-    </w:p>
-    <w:p>
-      <w:pPr>
-        <w:spacing w:before="160" w:after="40"/>
-      </w:pPr>
-      <w:r>
-        <w:rPr>
-          <w:rFonts w:ascii="Arial" w:hAnsi="Arial"/>
-          <w:b/>
-          <w:i w:val="0"/>
-          <w:color w:val="111827"/>
-          <w:sz w:val="23"/>
-        </w:rPr>
-        <w:t>Question 16 (K16) - PPT slides 32-36; Lab 4</w:t>
-      </w:r>
-    </w:p>
-    <w:p>
-      <w:pPr>
-        <w:spacing w:before="0" w:after="60"/>
-      </w:pPr>
-      <w:r>
-        <w:rPr>
-          <w:rFonts w:ascii="Arial" w:hAnsi="Arial"/>
-          <w:b/>
-          <w:i w:val="0"/>
-          <w:color w:val="111827"/>
-          <w:sz w:val="21"/>
-        </w:rPr>
-        <w:t>Why should autonomous actions be constrained?</w:t>
+        <w:t>Create a search index and data source, use an indexer to ingest content, and apply a skillset for OCR or other enrichment where required.</w:t>
       </w:r>
     </w:p>
     <w:p>
@@ -1964,7 +1604,7 @@
           <w:color w:val="111827"/>
           <w:sz w:val="20"/>
         </w:rPr>
-        <w:t>Constraints prevent uncontrolled decisions, accidental changes, privacy leaks, cost spikes, unsafe actions and actions without human approval.</w:t>
+        <w:t>Use vector search for semantic similarity and semantic ranking to improve relevance, then validate queries, security trimming and result quality.</w:t>
       </w:r>
     </w:p>
     <w:p>
@@ -1979,7 +1619,7 @@
           <w:color w:val="111827"/>
           <w:sz w:val="23"/>
         </w:rPr>
-        <w:t>Question 17 (K17) - PPT slides 37-41; Lab 5</w:t>
+        <w:t>Question 5 (K5) - PPT slides 58-62 and 63-67; Labs 9-10</w:t>
       </w:r>
     </w:p>
     <w:p>
@@ -1994,7 +1634,7 @@
           <w:color w:val="111827"/>
           <w:sz w:val="21"/>
         </w:rPr>
-        <w:t>What is OCR?</w:t>
+        <w:t>Explain how you would choose and validate Document Intelligence or Content Understanding models, integrate extracted content with search and generative AI, and operate the complete solution responsibly.</w:t>
       </w:r>
     </w:p>
     <w:p>
@@ -2010,37 +1650,7 @@
           <w:color w:val="111827"/>
           <w:sz w:val="20"/>
         </w:rPr>
-        <w:t>Optical character recognition extracts machine-readable text from images, screenshots, scanned forms or documents.</w:t>
-      </w:r>
-    </w:p>
-    <w:p>
-      <w:pPr>
-        <w:spacing w:before="160" w:after="40"/>
-      </w:pPr>
-      <w:r>
-        <w:rPr>
-          <w:rFonts w:ascii="Arial" w:hAnsi="Arial"/>
-          <w:b/>
-          <w:i w:val="0"/>
-          <w:color w:val="111827"/>
-          <w:sz w:val="23"/>
-        </w:rPr>
-        <w:t>Question 18 (K18) - PPT slides 37-41; Lab 5</w:t>
-      </w:r>
-    </w:p>
-    <w:p>
-      <w:pPr>
-        <w:spacing w:before="0" w:after="60"/>
-      </w:pPr>
-      <w:r>
-        <w:rPr>
-          <w:rFonts w:ascii="Arial" w:hAnsi="Arial"/>
-          <w:b/>
-          <w:i w:val="0"/>
-          <w:color w:val="111827"/>
-          <w:sz w:val="21"/>
-        </w:rPr>
-        <w:t>How is object detection different from classification?</w:t>
+        <w:t>Use a prebuilt model for supported common forms, a custom model for domain-specific fields, and a composed model when multiple document types require routing.</w:t>
       </w:r>
     </w:p>
     <w:p>
@@ -2056,37 +1666,7 @@
           <w:color w:val="111827"/>
           <w:sz w:val="20"/>
         </w:rPr>
-        <w:t>Classification assigns labels to an image, while object detection identifies objects and their locations, often with bounding boxes.</w:t>
-      </w:r>
-    </w:p>
-    <w:p>
-      <w:pPr>
-        <w:spacing w:before="160" w:after="40"/>
-      </w:pPr>
-      <w:r>
-        <w:rPr>
-          <w:rFonts w:ascii="Arial" w:hAnsi="Arial"/>
-          <w:b/>
-          <w:i w:val="0"/>
-          <w:color w:val="111827"/>
-          <w:sz w:val="23"/>
-        </w:rPr>
-        <w:t>Question 19 (K19) - PPT slides 37-41; Lab 5</w:t>
-      </w:r>
-    </w:p>
-    <w:p>
-      <w:pPr>
-        <w:spacing w:before="0" w:after="60"/>
-      </w:pPr>
-      <w:r>
-        <w:rPr>
-          <w:rFonts w:ascii="Arial" w:hAnsi="Arial"/>
-          <w:b/>
-          <w:i w:val="0"/>
-          <w:color w:val="111827"/>
-          <w:sz w:val="21"/>
-        </w:rPr>
-        <w:t>What does a custom vision model require?</w:t>
+        <w:t>Use confidence scores and validation rules to accept results, trigger exceptions or route low-confidence and high-impact cases to human review.</w:t>
       </w:r>
     </w:p>
     <w:p>
@@ -2102,37 +1682,7 @@
           <w:color w:val="111827"/>
           <w:sz w:val="20"/>
         </w:rPr>
-        <w:t>A defined task, representative labeled images, training and validation data, a selected model type, evaluation metrics and ongoing review for drift and bias.</w:t>
-      </w:r>
-    </w:p>
-    <w:p>
-      <w:pPr>
-        <w:spacing w:before="160" w:after="40"/>
-      </w:pPr>
-      <w:r>
-        <w:rPr>
-          <w:rFonts w:ascii="Arial" w:hAnsi="Arial"/>
-          <w:b/>
-          <w:i w:val="0"/>
-          <w:color w:val="111827"/>
-          <w:sz w:val="23"/>
-        </w:rPr>
-        <w:t>Question 20 (K20) - PPT slides 37-41; Lab 5</w:t>
-      </w:r>
-    </w:p>
-    <w:p>
-      <w:pPr>
-        <w:spacing w:before="0" w:after="60"/>
-      </w:pPr>
-      <w:r>
-        <w:rPr>
-          <w:rFonts w:ascii="Arial" w:hAnsi="Arial"/>
-          <w:b/>
-          <w:i w:val="0"/>
-          <w:color w:val="111827"/>
-          <w:sz w:val="21"/>
-        </w:rPr>
-        <w:t>Why is video analysis sensitive?</w:t>
+        <w:t>Use Content Understanding when the scenario spans documents, images, audio, video or text, and feed approved output into Azure AI Search and a grounded generative workflow.</w:t>
       </w:r>
     </w:p>
     <w:p>
@@ -2148,927 +1698,7 @@
           <w:color w:val="111827"/>
           <w:sz w:val="20"/>
         </w:rPr>
-        <w:t>Video may include faces, voices, locations, behavior or personal data, so privacy, consent, retention, security and bias controls are required.</w:t>
-      </w:r>
-    </w:p>
-    <w:p>
-      <w:pPr>
-        <w:spacing w:before="160" w:after="40"/>
-      </w:pPr>
-      <w:r>
-        <w:rPr>
-          <w:rFonts w:ascii="Arial" w:hAnsi="Arial"/>
-          <w:b/>
-          <w:i w:val="0"/>
-          <w:color w:val="111827"/>
-          <w:sz w:val="23"/>
-        </w:rPr>
-        <w:t>Question 21 (K21) - PPT slides 42-46; Lab 6</w:t>
-      </w:r>
-    </w:p>
-    <w:p>
-      <w:pPr>
-        <w:spacing w:before="0" w:after="60"/>
-      </w:pPr>
-      <w:r>
-        <w:rPr>
-          <w:rFonts w:ascii="Arial" w:hAnsi="Arial"/>
-          <w:b/>
-          <w:i w:val="0"/>
-          <w:color w:val="111827"/>
-          <w:sz w:val="21"/>
-        </w:rPr>
-        <w:t>What is entity recognition?</w:t>
-      </w:r>
-    </w:p>
-    <w:p>
-      <w:pPr>
-        <w:pStyle w:val="ListBullet"/>
-        <w:spacing w:after="40"/>
-      </w:pPr>
-      <w:r>
-        <w:rPr>
-          <w:rFonts w:ascii="Arial" w:hAnsi="Arial"/>
-          <w:b w:val="0"/>
-          <w:i w:val="0"/>
-          <w:color w:val="111827"/>
-          <w:sz w:val="20"/>
-        </w:rPr>
-        <w:t>A language capability that identifies named entities such as people, locations, organizations, dates, quantities and domain-specific terms in text.</w:t>
-      </w:r>
-    </w:p>
-    <w:p>
-      <w:pPr>
-        <w:spacing w:before="160" w:after="40"/>
-      </w:pPr>
-      <w:r>
-        <w:rPr>
-          <w:rFonts w:ascii="Arial" w:hAnsi="Arial"/>
-          <w:b/>
-          <w:i w:val="0"/>
-          <w:color w:val="111827"/>
-          <w:sz w:val="23"/>
-        </w:rPr>
-        <w:t>Question 22 (K22) - PPT slides 42-46; Lab 6</w:t>
-      </w:r>
-    </w:p>
-    <w:p>
-      <w:pPr>
-        <w:spacing w:before="0" w:after="60"/>
-      </w:pPr>
-      <w:r>
-        <w:rPr>
-          <w:rFonts w:ascii="Arial" w:hAnsi="Arial"/>
-          <w:b/>
-          <w:i w:val="0"/>
-          <w:color w:val="111827"/>
-          <w:sz w:val="21"/>
-        </w:rPr>
-        <w:t>Why detect PII before storing text?</w:t>
-      </w:r>
-    </w:p>
-    <w:p>
-      <w:pPr>
-        <w:pStyle w:val="ListBullet"/>
-        <w:spacing w:after="40"/>
-      </w:pPr>
-      <w:r>
-        <w:rPr>
-          <w:rFonts w:ascii="Arial" w:hAnsi="Arial"/>
-          <w:b w:val="0"/>
-          <w:i w:val="0"/>
-          <w:color w:val="111827"/>
-          <w:sz w:val="20"/>
-        </w:rPr>
-        <w:t>PII detection supports privacy protection, masking, minimization, compliance and safer downstream analytics or model use.</w:t>
-      </w:r>
-    </w:p>
-    <w:p>
-      <w:pPr>
-        <w:spacing w:before="160" w:after="40"/>
-      </w:pPr>
-      <w:r>
-        <w:rPr>
-          <w:rFonts w:ascii="Arial" w:hAnsi="Arial"/>
-          <w:b/>
-          <w:i w:val="0"/>
-          <w:color w:val="111827"/>
-          <w:sz w:val="23"/>
-        </w:rPr>
-        <w:t>Question 23 (K23) - PPT slides 42-46; Lab 6</w:t>
-      </w:r>
-    </w:p>
-    <w:p>
-      <w:pPr>
-        <w:spacing w:before="0" w:after="60"/>
-      </w:pPr>
-      <w:r>
-        <w:rPr>
-          <w:rFonts w:ascii="Arial" w:hAnsi="Arial"/>
-          <w:b/>
-          <w:i w:val="0"/>
-          <w:color w:val="111827"/>
-          <w:sz w:val="21"/>
-        </w:rPr>
-        <w:t>What is SSML?</w:t>
-      </w:r>
-    </w:p>
-    <w:p>
-      <w:pPr>
-        <w:pStyle w:val="ListBullet"/>
-        <w:spacing w:after="40"/>
-      </w:pPr>
-      <w:r>
-        <w:rPr>
-          <w:rFonts w:ascii="Arial" w:hAnsi="Arial"/>
-          <w:b w:val="0"/>
-          <w:i w:val="0"/>
-          <w:color w:val="111827"/>
-          <w:sz w:val="20"/>
-        </w:rPr>
-        <w:t>Speech Synthesis Markup Language controls text-to-speech output such as voice, pauses, pronunciation, emphasis, rate and pitch.</w:t>
-      </w:r>
-    </w:p>
-    <w:p>
-      <w:pPr>
-        <w:spacing w:before="160" w:after="40"/>
-      </w:pPr>
-      <w:r>
-        <w:rPr>
-          <w:rFonts w:ascii="Arial" w:hAnsi="Arial"/>
-          <w:b/>
-          <w:i w:val="0"/>
-          <w:color w:val="111827"/>
-          <w:sz w:val="23"/>
-        </w:rPr>
-        <w:t>Question 24 (K24) - PPT slides 42-46; Lab 6</w:t>
-      </w:r>
-    </w:p>
-    <w:p>
-      <w:pPr>
-        <w:spacing w:before="0" w:after="60"/>
-      </w:pPr>
-      <w:r>
-        <w:rPr>
-          <w:rFonts w:ascii="Arial" w:hAnsi="Arial"/>
-          <w:b/>
-          <w:i w:val="0"/>
-          <w:color w:val="111827"/>
-          <w:sz w:val="21"/>
-        </w:rPr>
-        <w:t>When should translation outputs be reviewed?</w:t>
-      </w:r>
-    </w:p>
-    <w:p>
-      <w:pPr>
-        <w:pStyle w:val="ListBullet"/>
-        <w:spacing w:after="40"/>
-      </w:pPr>
-      <w:r>
-        <w:rPr>
-          <w:rFonts w:ascii="Arial" w:hAnsi="Arial"/>
-          <w:b w:val="0"/>
-          <w:i w:val="0"/>
-          <w:color w:val="111827"/>
-          <w:sz w:val="20"/>
-        </w:rPr>
-        <w:t>Review is needed for regulated, customer-facing, ambiguous, sensitive, legal, medical, safety or high-impact communications.</w:t>
-      </w:r>
-    </w:p>
-    <w:p>
-      <w:pPr>
-        <w:spacing w:before="160" w:after="40"/>
-      </w:pPr>
-      <w:r>
-        <w:rPr>
-          <w:rFonts w:ascii="Arial" w:hAnsi="Arial"/>
-          <w:b/>
-          <w:i w:val="0"/>
-          <w:color w:val="111827"/>
-          <w:sz w:val="23"/>
-        </w:rPr>
-        <w:t>Question 25 (K25) - PPT slides 48-52; Lab 7</w:t>
-      </w:r>
-    </w:p>
-    <w:p>
-      <w:pPr>
-        <w:spacing w:before="0" w:after="60"/>
-      </w:pPr>
-      <w:r>
-        <w:rPr>
-          <w:rFonts w:ascii="Arial" w:hAnsi="Arial"/>
-          <w:b/>
-          <w:i w:val="0"/>
-          <w:color w:val="111827"/>
-          <w:sz w:val="21"/>
-        </w:rPr>
-        <w:t>What is an intent?</w:t>
-      </w:r>
-    </w:p>
-    <w:p>
-      <w:pPr>
-        <w:pStyle w:val="ListBullet"/>
-        <w:spacing w:after="40"/>
-      </w:pPr>
-      <w:r>
-        <w:rPr>
-          <w:rFonts w:ascii="Arial" w:hAnsi="Arial"/>
-          <w:b w:val="0"/>
-          <w:i w:val="0"/>
-          <w:color w:val="111827"/>
-          <w:sz w:val="20"/>
-        </w:rPr>
-        <w:t>The user goal or action expressed in an utterance, such as checking order status or requesting a refund.</w:t>
-      </w:r>
-    </w:p>
-    <w:p>
-      <w:pPr>
-        <w:spacing w:before="160" w:after="40"/>
-      </w:pPr>
-      <w:r>
-        <w:rPr>
-          <w:rFonts w:ascii="Arial" w:hAnsi="Arial"/>
-          <w:b/>
-          <w:i w:val="0"/>
-          <w:color w:val="111827"/>
-          <w:sz w:val="23"/>
-        </w:rPr>
-        <w:t>Question 26 (K26) - PPT slides 48-52; Lab 7</w:t>
-      </w:r>
-    </w:p>
-    <w:p>
-      <w:pPr>
-        <w:spacing w:before="0" w:after="60"/>
-      </w:pPr>
-      <w:r>
-        <w:rPr>
-          <w:rFonts w:ascii="Arial" w:hAnsi="Arial"/>
-          <w:b/>
-          <w:i w:val="0"/>
-          <w:color w:val="111827"/>
-          <w:sz w:val="21"/>
-        </w:rPr>
-        <w:t>What is an entity?</w:t>
-      </w:r>
-    </w:p>
-    <w:p>
-      <w:pPr>
-        <w:pStyle w:val="ListBullet"/>
-        <w:spacing w:after="40"/>
-      </w:pPr>
-      <w:r>
-        <w:rPr>
-          <w:rFonts w:ascii="Arial" w:hAnsi="Arial"/>
-          <w:b w:val="0"/>
-          <w:i w:val="0"/>
-          <w:color w:val="111827"/>
-          <w:sz w:val="20"/>
-        </w:rPr>
-        <w:t>A structured value extracted from user language, such as product name, order number, date, location or support category.</w:t>
-      </w:r>
-    </w:p>
-    <w:p>
-      <w:pPr>
-        <w:spacing w:before="160" w:after="40"/>
-      </w:pPr>
-      <w:r>
-        <w:rPr>
-          <w:rFonts w:ascii="Arial" w:hAnsi="Arial"/>
-          <w:b/>
-          <w:i w:val="0"/>
-          <w:color w:val="111827"/>
-          <w:sz w:val="23"/>
-        </w:rPr>
-        <w:t>Question 27 (K27) - PPT slides 48-52; Lab 7</w:t>
-      </w:r>
-    </w:p>
-    <w:p>
-      <w:pPr>
-        <w:spacing w:before="0" w:after="60"/>
-      </w:pPr>
-      <w:r>
-        <w:rPr>
-          <w:rFonts w:ascii="Arial" w:hAnsi="Arial"/>
-          <w:b/>
-          <w:i w:val="0"/>
-          <w:color w:val="111827"/>
-          <w:sz w:val="21"/>
-        </w:rPr>
-        <w:t>Why add alternate phrasing?</w:t>
-      </w:r>
-    </w:p>
-    <w:p>
-      <w:pPr>
-        <w:pStyle w:val="ListBullet"/>
-        <w:spacing w:after="40"/>
-      </w:pPr>
-      <w:r>
-        <w:rPr>
-          <w:rFonts w:ascii="Arial" w:hAnsi="Arial"/>
-          <w:b w:val="0"/>
-          <w:i w:val="0"/>
-          <w:color w:val="111827"/>
-          <w:sz w:val="20"/>
-        </w:rPr>
-        <w:t>Alternate utterances improve recognition of the same intent across varied wording, spelling, tone and language patterns.</w:t>
-      </w:r>
-    </w:p>
-    <w:p>
-      <w:pPr>
-        <w:spacing w:before="160" w:after="40"/>
-      </w:pPr>
-      <w:r>
-        <w:rPr>
-          <w:rFonts w:ascii="Arial" w:hAnsi="Arial"/>
-          <w:b/>
-          <w:i w:val="0"/>
-          <w:color w:val="111827"/>
-          <w:sz w:val="23"/>
-        </w:rPr>
-        <w:t>Question 28 (K28) - PPT slides 48-52; Lab 7</w:t>
-      </w:r>
-    </w:p>
-    <w:p>
-      <w:pPr>
-        <w:spacing w:before="0" w:after="60"/>
-      </w:pPr>
-      <w:r>
-        <w:rPr>
-          <w:rFonts w:ascii="Arial" w:hAnsi="Arial"/>
-          <w:b/>
-          <w:i w:val="0"/>
-          <w:color w:val="111827"/>
-          <w:sz w:val="21"/>
-        </w:rPr>
-        <w:t>Why should language projects be backed up?</w:t>
-      </w:r>
-    </w:p>
-    <w:p>
-      <w:pPr>
-        <w:pStyle w:val="ListBullet"/>
-        <w:spacing w:after="40"/>
-      </w:pPr>
-      <w:r>
-        <w:rPr>
-          <w:rFonts w:ascii="Arial" w:hAnsi="Arial"/>
-          <w:b w:val="0"/>
-          <w:i w:val="0"/>
-          <w:color w:val="111827"/>
-          <w:sz w:val="20"/>
-        </w:rPr>
-        <w:t>Backups protect training data, labels, configuration, versions and recovery plans if a project is corrupted, deleted or changed incorrectly.</w:t>
-      </w:r>
-    </w:p>
-    <w:p>
-      <w:pPr>
-        <w:spacing w:before="160" w:after="40"/>
-      </w:pPr>
-      <w:r>
-        <w:rPr>
-          <w:rFonts w:ascii="Arial" w:hAnsi="Arial"/>
-          <w:b/>
-          <w:i w:val="0"/>
-          <w:color w:val="111827"/>
-          <w:sz w:val="23"/>
-        </w:rPr>
-        <w:t>Question 29 (K29) - PPT slides 53-57; Lab 8</w:t>
-      </w:r>
-    </w:p>
-    <w:p>
-      <w:pPr>
-        <w:spacing w:before="0" w:after="60"/>
-      </w:pPr>
-      <w:r>
-        <w:rPr>
-          <w:rFonts w:ascii="Arial" w:hAnsi="Arial"/>
-          <w:b/>
-          <w:i w:val="0"/>
-          <w:color w:val="111827"/>
-          <w:sz w:val="21"/>
-        </w:rPr>
-        <w:t>What is an indexer?</w:t>
-      </w:r>
-    </w:p>
-    <w:p>
-      <w:pPr>
-        <w:pStyle w:val="ListBullet"/>
-        <w:spacing w:after="40"/>
-      </w:pPr>
-      <w:r>
-        <w:rPr>
-          <w:rFonts w:ascii="Arial" w:hAnsi="Arial"/>
-          <w:b w:val="0"/>
-          <w:i w:val="0"/>
-          <w:color w:val="111827"/>
-          <w:sz w:val="20"/>
-        </w:rPr>
-        <w:t>A component in Azure AI Search that reads content from a data source, extracts fields, applies enrichment if configured and populates an index.</w:t>
-      </w:r>
-    </w:p>
-    <w:p>
-      <w:pPr>
-        <w:spacing w:before="160" w:after="40"/>
-      </w:pPr>
-      <w:r>
-        <w:rPr>
-          <w:rFonts w:ascii="Arial" w:hAnsi="Arial"/>
-          <w:b/>
-          <w:i w:val="0"/>
-          <w:color w:val="111827"/>
-          <w:sz w:val="23"/>
-        </w:rPr>
-        <w:t>Question 30 (K30) - PPT slides 53-57; Lab 8</w:t>
-      </w:r>
-    </w:p>
-    <w:p>
-      <w:pPr>
-        <w:spacing w:before="0" w:after="60"/>
-      </w:pPr>
-      <w:r>
-        <w:rPr>
-          <w:rFonts w:ascii="Arial" w:hAnsi="Arial"/>
-          <w:b/>
-          <w:i w:val="0"/>
-          <w:color w:val="111827"/>
-          <w:sz w:val="21"/>
-        </w:rPr>
-        <w:t>What is a skillset?</w:t>
-      </w:r>
-    </w:p>
-    <w:p>
-      <w:pPr>
-        <w:pStyle w:val="ListBullet"/>
-        <w:spacing w:after="40"/>
-      </w:pPr>
-      <w:r>
-        <w:rPr>
-          <w:rFonts w:ascii="Arial" w:hAnsi="Arial"/>
-          <w:b w:val="0"/>
-          <w:i w:val="0"/>
-          <w:color w:val="111827"/>
-          <w:sz w:val="20"/>
-        </w:rPr>
-        <w:t>A pipeline of enrichment skills such as OCR, entity recognition, key phrase extraction, translation or custom skills applied during indexing.</w:t>
-      </w:r>
-    </w:p>
-    <w:p>
-      <w:pPr>
-        <w:spacing w:before="160" w:after="40"/>
-      </w:pPr>
-      <w:r>
-        <w:rPr>
-          <w:rFonts w:ascii="Arial" w:hAnsi="Arial"/>
-          <w:b/>
-          <w:i w:val="0"/>
-          <w:color w:val="111827"/>
-          <w:sz w:val="23"/>
-        </w:rPr>
-        <w:t>Question 31 (K31) - PPT slides 53-57; Lab 8</w:t>
-      </w:r>
-    </w:p>
-    <w:p>
-      <w:pPr>
-        <w:spacing w:before="0" w:after="60"/>
-      </w:pPr>
-      <w:r>
-        <w:rPr>
-          <w:rFonts w:ascii="Arial" w:hAnsi="Arial"/>
-          <w:b/>
-          <w:i w:val="0"/>
-          <w:color w:val="111827"/>
-          <w:sz w:val="21"/>
-        </w:rPr>
-        <w:t>What is vector search?</w:t>
-      </w:r>
-    </w:p>
-    <w:p>
-      <w:pPr>
-        <w:pStyle w:val="ListBullet"/>
-        <w:spacing w:after="40"/>
-      </w:pPr>
-      <w:r>
-        <w:rPr>
-          <w:rFonts w:ascii="Arial" w:hAnsi="Arial"/>
-          <w:b w:val="0"/>
-          <w:i w:val="0"/>
-          <w:color w:val="111827"/>
-          <w:sz w:val="20"/>
-        </w:rPr>
-        <w:t>Search that compares embeddings to find semantically similar content, even when the exact keywords differ.</w:t>
-      </w:r>
-    </w:p>
-    <w:p>
-      <w:pPr>
-        <w:spacing w:before="160" w:after="40"/>
-      </w:pPr>
-      <w:r>
-        <w:rPr>
-          <w:rFonts w:ascii="Arial" w:hAnsi="Arial"/>
-          <w:b/>
-          <w:i w:val="0"/>
-          <w:color w:val="111827"/>
-          <w:sz w:val="23"/>
-        </w:rPr>
-        <w:t>Question 32 (K32) - PPT slides 53-57; Lab 8</w:t>
-      </w:r>
-    </w:p>
-    <w:p>
-      <w:pPr>
-        <w:spacing w:before="0" w:after="60"/>
-      </w:pPr>
-      <w:r>
-        <w:rPr>
-          <w:rFonts w:ascii="Arial" w:hAnsi="Arial"/>
-          <w:b/>
-          <w:i w:val="0"/>
-          <w:color w:val="111827"/>
-          <w:sz w:val="21"/>
-        </w:rPr>
-        <w:t>Why use semantic ranking?</w:t>
-      </w:r>
-    </w:p>
-    <w:p>
-      <w:pPr>
-        <w:pStyle w:val="ListBullet"/>
-        <w:spacing w:after="40"/>
-      </w:pPr>
-      <w:r>
-        <w:rPr>
-          <w:rFonts w:ascii="Arial" w:hAnsi="Arial"/>
-          <w:b w:val="0"/>
-          <w:i w:val="0"/>
-          <w:color w:val="111827"/>
-          <w:sz w:val="20"/>
-        </w:rPr>
-        <w:t>Semantic ranking improves relevance by re-ranking results using language understanding rather than relying only on keyword matching.</w:t>
-      </w:r>
-    </w:p>
-    <w:p>
-      <w:pPr>
-        <w:spacing w:before="160" w:after="40"/>
-      </w:pPr>
-      <w:r>
-        <w:rPr>
-          <w:rFonts w:ascii="Arial" w:hAnsi="Arial"/>
-          <w:b/>
-          <w:i w:val="0"/>
-          <w:color w:val="111827"/>
-          <w:sz w:val="23"/>
-        </w:rPr>
-        <w:t>Question 33 (K33) - PPT slides 58-62; Lab 9</w:t>
-      </w:r>
-    </w:p>
-    <w:p>
-      <w:pPr>
-        <w:spacing w:before="0" w:after="60"/>
-      </w:pPr>
-      <w:r>
-        <w:rPr>
-          <w:rFonts w:ascii="Arial" w:hAnsi="Arial"/>
-          <w:b/>
-          <w:i w:val="0"/>
-          <w:color w:val="111827"/>
-          <w:sz w:val="21"/>
-        </w:rPr>
-        <w:t>When should you use a prebuilt model?</w:t>
-      </w:r>
-    </w:p>
-    <w:p>
-      <w:pPr>
-        <w:pStyle w:val="ListBullet"/>
-        <w:spacing w:after="40"/>
-      </w:pPr>
-      <w:r>
-        <w:rPr>
-          <w:rFonts w:ascii="Arial" w:hAnsi="Arial"/>
-          <w:b w:val="0"/>
-          <w:i w:val="0"/>
-          <w:color w:val="111827"/>
-          <w:sz w:val="20"/>
-        </w:rPr>
-        <w:t>Use a prebuilt model when the document type is supported and the required fields match common forms such as invoices, receipts, IDs or general documents.</w:t>
-      </w:r>
-    </w:p>
-    <w:p>
-      <w:pPr>
-        <w:spacing w:before="160" w:after="40"/>
-      </w:pPr>
-      <w:r>
-        <w:rPr>
-          <w:rFonts w:ascii="Arial" w:hAnsi="Arial"/>
-          <w:b/>
-          <w:i w:val="0"/>
-          <w:color w:val="111827"/>
-          <w:sz w:val="23"/>
-        </w:rPr>
-        <w:t>Question 34 (K34) - PPT slides 58-62; Lab 9</w:t>
-      </w:r>
-    </w:p>
-    <w:p>
-      <w:pPr>
-        <w:spacing w:before="0" w:after="60"/>
-      </w:pPr>
-      <w:r>
-        <w:rPr>
-          <w:rFonts w:ascii="Arial" w:hAnsi="Arial"/>
-          <w:b/>
-          <w:i w:val="0"/>
-          <w:color w:val="111827"/>
-          <w:sz w:val="21"/>
-        </w:rPr>
-        <w:t>What is a composed model?</w:t>
-      </w:r>
-    </w:p>
-    <w:p>
-      <w:pPr>
-        <w:pStyle w:val="ListBullet"/>
-        <w:spacing w:after="40"/>
-      </w:pPr>
-      <w:r>
-        <w:rPr>
-          <w:rFonts w:ascii="Arial" w:hAnsi="Arial"/>
-          <w:b w:val="0"/>
-          <w:i w:val="0"/>
-          <w:color w:val="111827"/>
-          <w:sz w:val="20"/>
-        </w:rPr>
-        <w:t>A composed Document Intelligence model routes documents to one of several custom models so different form types can be processed through a single endpoint.</w:t>
-      </w:r>
-    </w:p>
-    <w:p>
-      <w:pPr>
-        <w:spacing w:before="160" w:after="40"/>
-      </w:pPr>
-      <w:r>
-        <w:rPr>
-          <w:rFonts w:ascii="Arial" w:hAnsi="Arial"/>
-          <w:b/>
-          <w:i w:val="0"/>
-          <w:color w:val="111827"/>
-          <w:sz w:val="23"/>
-        </w:rPr>
-        <w:t>Question 35 (K35) - PPT slides 58-62; Lab 9</w:t>
-      </w:r>
-    </w:p>
-    <w:p>
-      <w:pPr>
-        <w:spacing w:before="0" w:after="60"/>
-      </w:pPr>
-      <w:r>
-        <w:rPr>
-          <w:rFonts w:ascii="Arial" w:hAnsi="Arial"/>
-          <w:b/>
-          <w:i w:val="0"/>
-          <w:color w:val="111827"/>
-          <w:sz w:val="21"/>
-        </w:rPr>
-        <w:t>Why are confidence scores useful?</w:t>
-      </w:r>
-    </w:p>
-    <w:p>
-      <w:pPr>
-        <w:pStyle w:val="ListBullet"/>
-        <w:spacing w:after="40"/>
-      </w:pPr>
-      <w:r>
-        <w:rPr>
-          <w:rFonts w:ascii="Arial" w:hAnsi="Arial"/>
-          <w:b w:val="0"/>
-          <w:i w:val="0"/>
-          <w:color w:val="111827"/>
-          <w:sz w:val="20"/>
-        </w:rPr>
-        <w:t>They help decide whether extraction can be accepted automatically, needs review or should trigger exception handling.</w:t>
-      </w:r>
-    </w:p>
-    <w:p>
-      <w:pPr>
-        <w:spacing w:before="160" w:after="40"/>
-      </w:pPr>
-      <w:r>
-        <w:rPr>
-          <w:rFonts w:ascii="Arial" w:hAnsi="Arial"/>
-          <w:b/>
-          <w:i w:val="0"/>
-          <w:color w:val="111827"/>
-          <w:sz w:val="23"/>
-        </w:rPr>
-        <w:t>Question 36 (K36) - PPT slides 58-62; Lab 9</w:t>
-      </w:r>
-    </w:p>
-    <w:p>
-      <w:pPr>
-        <w:spacing w:before="0" w:after="60"/>
-      </w:pPr>
-      <w:r>
-        <w:rPr>
-          <w:rFonts w:ascii="Arial" w:hAnsi="Arial"/>
-          <w:b/>
-          <w:i w:val="0"/>
-          <w:color w:val="111827"/>
-          <w:sz w:val="21"/>
-        </w:rPr>
-        <w:t>What content types can Content Understanding process?</w:t>
-      </w:r>
-    </w:p>
-    <w:p>
-      <w:pPr>
-        <w:pStyle w:val="ListBullet"/>
-        <w:spacing w:after="40"/>
-      </w:pPr>
-      <w:r>
-        <w:rPr>
-          <w:rFonts w:ascii="Arial" w:hAnsi="Arial"/>
-          <w:b w:val="0"/>
-          <w:i w:val="0"/>
-          <w:color w:val="111827"/>
-          <w:sz w:val="20"/>
-        </w:rPr>
-        <w:t>It can process multiple modalities such as documents, images, audio, video and text depending on the configured analyzer and scenario.</w:t>
-      </w:r>
-    </w:p>
-    <w:p>
-      <w:pPr>
-        <w:spacing w:before="160" w:after="40"/>
-      </w:pPr>
-      <w:r>
-        <w:rPr>
-          <w:rFonts w:ascii="Arial" w:hAnsi="Arial"/>
-          <w:b/>
-          <w:i w:val="0"/>
-          <w:color w:val="111827"/>
-          <w:sz w:val="23"/>
-        </w:rPr>
-        <w:t>Question 37 (K37) - PPT slides 63-67; Lab 10</w:t>
-      </w:r>
-    </w:p>
-    <w:p>
-      <w:pPr>
-        <w:spacing w:before="0" w:after="60"/>
-      </w:pPr>
-      <w:r>
-        <w:rPr>
-          <w:rFonts w:ascii="Arial" w:hAnsi="Arial"/>
-          <w:b/>
-          <w:i w:val="0"/>
-          <w:color w:val="111827"/>
-          <w:sz w:val="21"/>
-        </w:rPr>
-        <w:t>Which service should power grounded document search?</w:t>
-      </w:r>
-    </w:p>
-    <w:p>
-      <w:pPr>
-        <w:pStyle w:val="ListBullet"/>
-        <w:spacing w:after="40"/>
-      </w:pPr>
-      <w:r>
-        <w:rPr>
-          <w:rFonts w:ascii="Arial" w:hAnsi="Arial"/>
-          <w:b w:val="0"/>
-          <w:i w:val="0"/>
-          <w:color w:val="111827"/>
-          <w:sz w:val="20"/>
-        </w:rPr>
-        <w:t>Azure AI Search should power document retrieval and grounding, often combined with Azure OpenAI or Foundry for RAG.</w:t>
-      </w:r>
-    </w:p>
-    <w:p>
-      <w:pPr>
-        <w:spacing w:before="160" w:after="40"/>
-      </w:pPr>
-      <w:r>
-        <w:rPr>
-          <w:rFonts w:ascii="Arial" w:hAnsi="Arial"/>
-          <w:b/>
-          <w:i w:val="0"/>
-          <w:color w:val="111827"/>
-          <w:sz w:val="23"/>
-        </w:rPr>
-        <w:t>Question 38 (K38) - PPT slides 63-67; Lab 10</w:t>
-      </w:r>
-    </w:p>
-    <w:p>
-      <w:pPr>
-        <w:spacing w:before="0" w:after="60"/>
-      </w:pPr>
-      <w:r>
-        <w:rPr>
-          <w:rFonts w:ascii="Arial" w:hAnsi="Arial"/>
-          <w:b/>
-          <w:i w:val="0"/>
-          <w:color w:val="111827"/>
-          <w:sz w:val="21"/>
-        </w:rPr>
-        <w:t>When should a human review AI output?</w:t>
-      </w:r>
-    </w:p>
-    <w:p>
-      <w:pPr>
-        <w:pStyle w:val="ListBullet"/>
-        <w:spacing w:after="40"/>
-      </w:pPr>
-      <w:r>
-        <w:rPr>
-          <w:rFonts w:ascii="Arial" w:hAnsi="Arial"/>
-          <w:b w:val="0"/>
-          <w:i w:val="0"/>
-          <w:color w:val="111827"/>
-          <w:sz w:val="20"/>
-        </w:rPr>
-        <w:t>Human review is needed for low-confidence, high-impact, harmful, sensitive, regulated, ambiguous or escalated outputs.</w:t>
-      </w:r>
-    </w:p>
-    <w:p>
-      <w:pPr>
-        <w:spacing w:before="160" w:after="40"/>
-      </w:pPr>
-      <w:r>
-        <w:rPr>
-          <w:rFonts w:ascii="Arial" w:hAnsi="Arial"/>
-          <w:b/>
-          <w:i w:val="0"/>
-          <w:color w:val="111827"/>
-          <w:sz w:val="23"/>
-        </w:rPr>
-        <w:t>Question 39 (K39) - PPT slides 63-67; Lab 10</w:t>
-      </w:r>
-    </w:p>
-    <w:p>
-      <w:pPr>
-        <w:spacing w:before="0" w:after="60"/>
-      </w:pPr>
-      <w:r>
-        <w:rPr>
-          <w:rFonts w:ascii="Arial" w:hAnsi="Arial"/>
-          <w:b/>
-          <w:i w:val="0"/>
-          <w:color w:val="111827"/>
-          <w:sz w:val="21"/>
-        </w:rPr>
-        <w:t>What is the difference between RAG and fine-tuning?</w:t>
-      </w:r>
-    </w:p>
-    <w:p>
-      <w:pPr>
-        <w:pStyle w:val="ListBullet"/>
-        <w:spacing w:after="40"/>
-      </w:pPr>
-      <w:r>
-        <w:rPr>
-          <w:rFonts w:ascii="Arial" w:hAnsi="Arial"/>
-          <w:b w:val="0"/>
-          <w:i w:val="0"/>
-          <w:color w:val="111827"/>
-          <w:sz w:val="20"/>
-        </w:rPr>
-        <w:t>RAG retrieves external knowledge at runtime to ground answers; fine-tuning changes model behavior using training examples and does not itself provide current source knowledge.</w:t>
-      </w:r>
-    </w:p>
-    <w:p>
-      <w:pPr>
-        <w:spacing w:before="160" w:after="40"/>
-      </w:pPr>
-      <w:r>
-        <w:rPr>
-          <w:rFonts w:ascii="Arial" w:hAnsi="Arial"/>
-          <w:b/>
-          <w:i w:val="0"/>
-          <w:color w:val="111827"/>
-          <w:sz w:val="23"/>
-        </w:rPr>
-        <w:t>Question 40 (K40) - PPT slides 63-67; Lab 10</w:t>
-      </w:r>
-    </w:p>
-    <w:p>
-      <w:pPr>
-        <w:spacing w:before="0" w:after="60"/>
-      </w:pPr>
-      <w:r>
-        <w:rPr>
-          <w:rFonts w:ascii="Arial" w:hAnsi="Arial"/>
-          <w:b/>
-          <w:i w:val="0"/>
-          <w:color w:val="111827"/>
-          <w:sz w:val="21"/>
-        </w:rPr>
-        <w:t>Which AI workload do you need to review most?</w:t>
-      </w:r>
-    </w:p>
-    <w:p>
-      <w:pPr>
-        <w:pStyle w:val="ListBullet"/>
-        <w:spacing w:after="40"/>
-      </w:pPr>
-      <w:r>
-        <w:rPr>
-          <w:rFonts w:ascii="Arial" w:hAnsi="Arial"/>
-          <w:b w:val="0"/>
-          <w:i w:val="0"/>
-          <w:color w:val="111827"/>
-          <w:sz w:val="20"/>
-        </w:rPr>
-        <w:t>The learner should identify their weakest AI-102 workload and justify it using confidence ratings, lab evidence and a practical review plan.</w:t>
+        <w:t>Document the service architecture, security, monitoring, cost, governance and cleanup plan; use RAG for current external knowledge and fine-tuning only when model behavior needs adaptation.</w:t>
       </w:r>
     </w:p>
     <w:sectPr>

</xml_diff>